<commit_message>
Add Saat Kulesi Vakası case
</commit_message>
<xml_diff>
--- a/dedektiflemece/Gece2.docx
+++ b/dedektiflemece/Gece2.docx
@@ -4,6 +4,21 @@
   <w:body>
     <w:p>
       <w:pPr>
+        <w:pStyle w:val="BodyText"/>
+        <w:rPr>
+          <w:rFonts w:ascii="Times New Roman" w:hAnsi="Times New Roman"/>
+        </w:rPr>
+      </w:pPr>
+      <w:r>
+        <w:rPr>
+          <w:rStyle w:val="Strong"/>
+          <w:rFonts w:ascii="Times New Roman" w:hAnsi="Times New Roman"/>
+        </w:rPr>
+        <w:t>1. Aziz Gets the Call — THE CASE</w:t>
+      </w:r>
+    </w:p>
+    <w:p>
+      <w:pPr>
         <w:pStyle w:val="Normal"/>
         <w:rPr>
           <w:rFonts w:ascii="Times New Roman" w:hAnsi="Times New Roman"/>
@@ -69,6 +84,34 @@
         <w:rPr>
           <w:rFonts w:ascii="Times New Roman" w:hAnsi="Times New Roman"/>
         </w:rPr>
+      </w:r>
+    </w:p>
+    <w:p>
+      <w:pPr>
+        <w:pStyle w:val="BodyText"/>
+        <w:rPr>
+          <w:rFonts w:ascii="Times New Roman" w:hAnsi="Times New Roman"/>
+        </w:rPr>
+      </w:pPr>
+      <w:r>
+        <w:rPr>
+          <w:rStyle w:val="Strong"/>
+          <w:rFonts w:ascii="Times New Roman" w:hAnsi="Times New Roman"/>
+        </w:rPr>
+        <w:t>2. The Place — THE SCENE</w:t>
+      </w:r>
+    </w:p>
+    <w:p>
+      <w:pPr>
+        <w:pStyle w:val="Normal"/>
+        <w:rPr>
+          <w:rFonts w:ascii="Times New Roman" w:hAnsi="Times New Roman"/>
+        </w:rPr>
+      </w:pPr>
+      <w:r>
+        <w:rPr>
+          <w:rFonts w:ascii="Times New Roman" w:hAnsi="Times New Roman"/>
+        </w:rPr>
         <w:t xml:space="preserve">Aziz, kuleye vardığında yağmurun ince taneleri taş merdivenlere vuruyor, her damla gecenin ritmine bir nota ekliyordu. Saat Odası’nın kapısı içeriden kilitliydi; </w:t>
       </w:r>
       <w:r>
@@ -161,6 +204,34 @@
         <w:rPr>
           <w:rFonts w:ascii="Times New Roman" w:hAnsi="Times New Roman"/>
         </w:rPr>
+      </w:r>
+    </w:p>
+    <w:p>
+      <w:pPr>
+        <w:pStyle w:val="BodyText"/>
+        <w:rPr>
+          <w:rFonts w:ascii="Times New Roman" w:hAnsi="Times New Roman"/>
+        </w:rPr>
+      </w:pPr>
+      <w:r>
+        <w:rPr>
+          <w:rStyle w:val="Strong"/>
+          <w:rFonts w:ascii="Times New Roman" w:hAnsi="Times New Roman"/>
+        </w:rPr>
+        <w:t>3. The Victim — THE MOTIVE</w:t>
+      </w:r>
+    </w:p>
+    <w:p>
+      <w:pPr>
+        <w:pStyle w:val="Normal"/>
+        <w:rPr>
+          <w:rFonts w:ascii="Times New Roman" w:hAnsi="Times New Roman"/>
+        </w:rPr>
+      </w:pPr>
+      <w:r>
+        <w:rPr>
+          <w:rFonts w:ascii="Times New Roman" w:hAnsi="Times New Roman"/>
+        </w:rPr>
         <w:t>Rız</w:t>
       </w:r>
       <w:r>
@@ -235,6 +306,22 @@
           <w:lang w:val="tr-TR"/>
         </w:rPr>
         <w:t>Saat kulesinde bu cinayetin işlenmiş olabileceği üç bölüm var. Kulenin en yüksek noktasındaö hemen hemen 10 metre yükseklikteki, saat mekanizma odası, Bodrumdaki Tarihi arşiv ve kulenin bitişiğindeki Tamir Atölyesi.</w:t>
+      </w:r>
+    </w:p>
+    <w:p>
+      <w:pPr>
+        <w:pStyle w:val="BodyText"/>
+        <w:rPr>
+          <w:rFonts w:ascii="Times New Roman" w:hAnsi="Times New Roman"/>
+        </w:rPr>
+      </w:pPr>
+      <w:r>
+        <w:rPr>
+          <w:rStyle w:val="Strong"/>
+          <w:rFonts w:ascii="Times New Roman" w:hAnsi="Times New Roman"/>
+          <w:lang w:val="tr-TR"/>
+        </w:rPr>
+        <w:t xml:space="preserve">4. The Three Suspects </w:t>
       </w:r>
     </w:p>
     <w:p>
@@ -636,7 +723,7 @@
     </w:p>
     <w:p>
       <w:pPr>
-        <w:pStyle w:val="Normal"/>
+        <w:pStyle w:val="Heading3"/>
         <w:rPr>
           <w:rFonts w:ascii="Times New Roman" w:hAnsi="Times New Roman"/>
           <w:u w:val="single"/>
@@ -649,7 +736,7 @@
           <w:u w:val="single"/>
           <w:lang w:val="tr-TR"/>
         </w:rPr>
-        <w:t>İp uçları:</w:t>
+        <w:t>5. The Evidence — THE PUZZLE</w:t>
       </w:r>
     </w:p>
     <w:p>
@@ -775,6 +862,54 @@
           <w:lang w:val="tr-TR"/>
         </w:rPr>
         <w:t>SİLAHLAR: İpek Atkı, Tornavida, Çekiç</w:t>
+      </w:r>
+    </w:p>
+    <w:p>
+      <w:pPr>
+        <w:pStyle w:val="Heading3"/>
+        <w:rPr>
+          <w:rFonts w:ascii="Times New Roman" w:hAnsi="Times New Roman"/>
+        </w:rPr>
+      </w:pPr>
+      <w:r>
+        <w:rPr>
+          <w:rFonts w:ascii="Times New Roman" w:hAnsi="Times New Roman"/>
+          <w:lang w:val="tr-TR"/>
+        </w:rPr>
+      </w:r>
+    </w:p>
+    <w:p>
+      <w:pPr>
+        <w:pStyle w:val="Heading3"/>
+        <w:rPr>
+          <w:rFonts w:ascii="Times New Roman" w:hAnsi="Times New Roman"/>
+        </w:rPr>
+      </w:pPr>
+      <w:r>
+        <w:rPr>
+          <w:rFonts w:ascii="Times New Roman" w:hAnsi="Times New Roman"/>
+          <w:lang w:val="tr-TR"/>
+        </w:rPr>
+        <w:t>7. Opportunity — THE ELIMINATION</w:t>
+      </w:r>
+    </w:p>
+    <w:p>
+      <w:pPr>
+        <w:pStyle w:val="Heading3"/>
+        <w:rPr/>
+      </w:pPr>
+      <w:r>
+        <w:rPr/>
+      </w:r>
+    </w:p>
+    <w:p>
+      <w:pPr>
+        <w:pStyle w:val="Heading3"/>
+        <w:rPr/>
+      </w:pPr>
+      <w:r>
+        <w:rPr/>
+        <w:t>8.SOLUTION</w:t>
       </w:r>
     </w:p>
     <w:p>
@@ -1952,6 +2087,14 @@
     <w:qFormat/>
     <w:rPr/>
   </w:style>
+  <w:style w:type="character" w:styleId="Strong">
+    <w:name w:val="Strong"/>
+    <w:qFormat/>
+    <w:rPr>
+      <w:b/>
+      <w:bCs/>
+    </w:rPr>
+  </w:style>
   <w:style w:type="paragraph" w:styleId="Heading">
     <w:name w:val="Heading"/>
     <w:basedOn w:val="Normal"/>

</xml_diff>